<commit_message>
Update Bible study notes content for multiple languages for 2026-06-09 release
</commit_message>
<xml_diff>
--- a/fra/docx/13.content.docx
+++ b/fra/docx/13.content.docx
@@ -8691,6 +8691,67 @@
           <w:lang w:val="fr_FR" w:bidi="fr_FR"/>
         </w:rPr>
         <w:t xml:space="preserve"> est probablement une mélodie, censée être chantée dans la gamme soprano (liée à l’hébreu « almah », « jeune femme »).</w:t>
+      </w:r>
+      <w:r>
+        <w:rPr>
+          <w:lang w:val="fr_FR" w:bidi="fr_FR"/>
+        </w:rPr>
+      </w:r>
+      <w:r>
+        <w:rPr>
+          <w:lang w:val="fr_FR" w:bidi="fr_FR"/>
+        </w:rPr>
+      </w:r>
+    </w:p>
+    <w:p>
+      <w:pPr/>
+      <w:r>
+        <w:rPr>
+          <w:lang w:val="fr_FR" w:bidi="fr_FR"/>
+        </w:rPr>
+      </w:r>
+    </w:p>
+    <w:p>
+      <w:pPr>
+        <w:pStyle w:val="Heading2"/>
+      </w:pPr>
+      <w:r>
+        <w:rPr>
+          <w:lang w:val="fr_FR" w:bidi="fr_FR"/>
+        </w:rPr>
+        <w:t>1 Chroniques 15.21</w:t>
+      </w:r>
+      <w:r>
+        <w:rPr>
+          <w:lang w:val="fr_FR" w:bidi="fr_FR"/>
+        </w:rPr>
+      </w:r>
+    </w:p>
+    <w:p>
+      <w:pPr/>
+      <w:r>
+        <w:rPr>
+          <w:lang w:val="fr_FR" w:bidi="fr_FR"/>
+        </w:rPr>
+      </w:r>
+      <w:r>
+        <w:rPr>
+          <w:lang w:val="fr_FR" w:bidi="fr_FR"/>
+        </w:rPr>
+        <w:t xml:space="preserve">harpes (ou lyres, cithares) : Le texte hébreu ajoute « sur schéminith ». L'interprétation du terme </w:t>
+      </w:r>
+      <w:r>
+        <w:rPr>
+          <w:i/>
+          <w:lang w:val="fr_FR" w:bidi="fr_FR"/>
+        </w:rPr>
+        <w:t>schéminith</w:t>
+      </w:r>
+      <w:r>
+        <w:rPr>
+          <w:lang w:val="fr_FR" w:bidi="fr_FR"/>
+        </w:rPr>
+        <w:t xml:space="preserve"> est incertaine, et il est traduit différemment d'une version française à l'autre. Certaines versions préfèrent ne pas le traduire (voir par exemple Bible annotée, Nouvelle Bible Segond, Bible juive complète). Certaines versions traduisent « à huit cordes » : par exemple LSG, Ostervald, Segond 21, Semeur. D'autres comprennent cette expression comme désignant une « octave » : par exemple « lyres à l'octove » (Traduction œcuménique), « cithares à l'octave » (Traduction officielle liturgique). Cela suggère peut-être une gamme vocale plus basse, voir par exemple : « octave de basse » (Perret-Gentil et Rilliet), « notes graves » (Français courant, Nouvelle français courant, Parole de vie).</w:t>
       </w:r>
       <w:r>
         <w:rPr>

</xml_diff>